<commit_message>
Add DOCX fixture, determinism, and limits tests; adjust fixtures (A7)
</commit_message>
<xml_diff>
--- a/fixtures/docx/numbered-list.docx
+++ b/fixtures/docx/numbered-list.docx
@@ -5,6 +5,14 @@
     <w:p>
       <w:r>
         <w:t xml:space="preserve">Python basics quiz</w:t>
+      </w:r>
+    </w:p>
+    <w:p>
+      <w:pPr>
+        <w:pStyle w:val="Heading1"/>
+      </w:pPr>
+      <w:r>
+        <w:t xml:space="preserve">Week 1</w:t>
       </w:r>
     </w:p>
     <w:p>

</xml_diff>